<commit_message>
Add GitHub repo link to blog article (HTML + docx)
Link added in two places: end of Conclusion paragraph and author bio footer.

Co-Authored-By: Claude Sonnet 4.6 <noreply@anthropic.com>
</commit_message>
<xml_diff>
--- a/epmpoint-blog-article.docx
+++ b/epmpoint-blog-article.docx
@@ -4,7 +4,7 @@
   <w:body>
     <w:p>
       <w:pPr>
-        <w:divId w:val="810292066"/>
+        <w:divId w:val="1611552057"/>
         <w:rPr>
           <w:rFonts w:ascii="Calibri" w:eastAsia="Times New Roman" w:hAnsi="Calibri" w:cs="Calibri"/>
           <w:color w:val="212121"/>
@@ -140,7 +140,7 @@
     </w:p>
     <w:p>
       <w:pPr>
-        <w:divId w:val="815993646"/>
+        <w:divId w:val="78448465"/>
         <w:rPr>
           <w:rFonts w:ascii="Calibri" w:eastAsia="Times New Roman" w:hAnsi="Calibri" w:cs="Calibri"/>
           <w:color w:val="6B7280"/>
@@ -196,7 +196,7 @@
         </w:rPr>
         <w:lastRenderedPageBreak/>
         <w:drawing>
-          <wp:inline distT="0" distB="0" distL="0" distR="0" wp14:anchorId="1A64ACFB" wp14:editId="234CDEF2">
+          <wp:inline distT="0" distB="0" distL="0" distR="0" wp14:anchorId="24A05EBB" wp14:editId="375F0147">
             <wp:extent cx="8769801" cy="6369377"/>
             <wp:effectExtent l="0" t="0" r="0" b="0"/>
             <wp:docPr id="1" name="Picture 1" descr="Home page of the IT Asset Request Portal — hero section with navigation and call-to-action buttons"/>
@@ -400,7 +400,7 @@
           <w:sz w:val="22"/>
           <w:szCs w:val="22"/>
         </w:rPr>
-        <w:pict w14:anchorId="5711A183">
+        <w:pict w14:anchorId="52C0D65C">
           <v:rect id="_x0000_i1026" style="width:0;height:1.5pt" o:hralign="center" o:hrstd="t" o:hr="t" fillcolor="#a0a0a0" stroked="f"/>
         </w:pict>
       </w:r>
@@ -1343,7 +1343,7 @@
           <w:sz w:val="22"/>
           <w:szCs w:val="22"/>
         </w:rPr>
-        <w:pict w14:anchorId="5A6DEFE3">
+        <w:pict w14:anchorId="4AEC71E5">
           <v:rect id="_x0000_i1027" style="width:0;height:1.5pt" o:hralign="center" o:hrstd="t" o:hr="t" fillcolor="#a0a0a0" stroked="f"/>
         </w:pict>
       </w:r>
@@ -1428,7 +1428,7 @@
     <w:p>
       <w:pPr>
         <w:shd w:val="clear" w:color="auto" w:fill="F0F9FF"/>
-        <w:divId w:val="1766800572"/>
+        <w:divId w:val="2103723147"/>
         <w:rPr>
           <w:rFonts w:ascii="Calibri" w:eastAsia="Times New Roman" w:hAnsi="Calibri" w:cs="Calibri"/>
           <w:color w:val="212121"/>
@@ -1508,7 +1508,7 @@
           <w:szCs w:val="22"/>
         </w:rPr>
         <w:drawing>
-          <wp:inline distT="0" distB="0" distL="0" distR="0" wp14:anchorId="4698B460" wp14:editId="6B4CA9B4">
+          <wp:inline distT="0" distB="0" distL="0" distR="0" wp14:anchorId="6BDA3C4D" wp14:editId="2E483535">
             <wp:extent cx="8763000" cy="5810250"/>
             <wp:effectExtent l="0" t="0" r="0" b="0"/>
             <wp:docPr id="4" name="Picture 4" descr="Claude Code terminal session showing the actual commands and output used to scaffold and build the IT Asset Request Portal — npm install, git commits for each page, and the final production vite build."/>
@@ -1605,7 +1605,7 @@
           <w:sz w:val="22"/>
           <w:szCs w:val="22"/>
         </w:rPr>
-        <w:pict w14:anchorId="77174EA1">
+        <w:pict w14:anchorId="232E0700">
           <v:rect id="_x0000_i1029" style="width:0;height:1.5pt" o:hralign="center" o:hrstd="t" o:hr="t" fillcolor="#a0a0a0" stroked="f"/>
         </w:pict>
       </w:r>
@@ -2410,7 +2410,7 @@
           <w:sz w:val="22"/>
           <w:szCs w:val="22"/>
         </w:rPr>
-        <w:pict w14:anchorId="54307A96">
+        <w:pict w14:anchorId="37CF4F30">
           <v:rect id="_x0000_i1030" style="width:0;height:1.5pt" o:hralign="center" o:hrstd="t" o:hr="t" fillcolor="#a0a0a0" stroked="f"/>
         </w:pict>
       </w:r>
@@ -2493,7 +2493,7 @@
           <w:szCs w:val="22"/>
         </w:rPr>
         <w:drawing>
-          <wp:inline distT="0" distB="0" distL="0" distR="0" wp14:anchorId="62DBAF52" wp14:editId="20E1CD09">
+          <wp:inline distT="0" distB="0" distL="0" distR="0" wp14:anchorId="271DA328" wp14:editId="3708EA48">
             <wp:extent cx="11322632" cy="6102664"/>
             <wp:effectExtent l="0" t="0" r="0" b="0"/>
             <wp:docPr id="7" name="Picture 7" descr="Home page — hero section with stats strip and feature navigation cards"/>
@@ -2650,7 +2650,7 @@
           <w:szCs w:val="22"/>
         </w:rPr>
         <w:drawing>
-          <wp:inline distT="0" distB="0" distL="0" distR="0" wp14:anchorId="1183897F" wp14:editId="7E3E7B97">
+          <wp:inline distT="0" distB="0" distL="0" distR="0" wp14:anchorId="6C10A133" wp14:editId="55050196">
             <wp:extent cx="7810901" cy="6026460"/>
             <wp:effectExtent l="0" t="0" r="0" b="0"/>
             <wp:docPr id="8" name="Picture 8" descr="Asset Catalog — category filter tabs and the asset card grid showing laptops, monitors, peripherals and software"/>
@@ -2893,7 +2893,7 @@
           <w:szCs w:val="22"/>
         </w:rPr>
         <w:drawing>
-          <wp:inline distT="0" distB="0" distL="0" distR="0" wp14:anchorId="3E18415F" wp14:editId="4390BA8B">
+          <wp:inline distT="0" distB="0" distL="0" distR="0" wp14:anchorId="3C1AAC3D" wp14:editId="664E6458">
             <wp:extent cx="7798201" cy="4559534"/>
             <wp:effectExtent l="0" t="0" r="0" b="0"/>
             <wp:docPr id="9" name="Picture 9" descr="Request Form — Step 1 (Asset Details) and Step 3 (Confirmation screen with generated Request ID)"/>
@@ -3034,7 +3034,7 @@
           <w:szCs w:val="22"/>
         </w:rPr>
         <w:drawing>
-          <wp:inline distT="0" distB="0" distL="0" distR="0" wp14:anchorId="225148F4" wp14:editId="2368860B">
+          <wp:inline distT="0" distB="0" distL="0" distR="0" wp14:anchorId="686C690B" wp14:editId="2206CC79">
             <wp:extent cx="9207973" cy="5664491"/>
             <wp:effectExtent l="0" t="0" r="0" b="0"/>
             <wp:docPr id="10" name="Picture 10" descr="Status Tracker — request table with search, status filter buttons, and an expanded IT note row"/>
@@ -3175,7 +3175,7 @@
           <w:szCs w:val="22"/>
         </w:rPr>
         <w:drawing>
-          <wp:inline distT="0" distB="0" distL="0" distR="0" wp14:anchorId="7BEB1FD2" wp14:editId="0630B49A">
+          <wp:inline distT="0" distB="0" distL="0" distR="0" wp14:anchorId="79DF12FF" wp14:editId="7DE8C70E">
             <wp:extent cx="8674546" cy="5988358"/>
             <wp:effectExtent l="0" t="0" r="0" b="0"/>
             <wp:docPr id="11" name="Picture 11" descr="Admin Dashboard — metric cards, approval queue table with Approve/Reject actions, and category bar chart"/>
@@ -3269,7 +3269,7 @@
           <w:sz w:val="22"/>
           <w:szCs w:val="22"/>
         </w:rPr>
-        <w:pict w14:anchorId="158D2E6C">
+        <w:pict w14:anchorId="66295F31">
           <v:rect id="_x0000_i1036" style="width:0;height:1.5pt" o:hralign="center" o:hrstd="t" o:hr="t" fillcolor="#a0a0a0" stroked="f"/>
         </w:pict>
       </w:r>
@@ -3577,7 +3577,7 @@
           <w:sz w:val="22"/>
           <w:szCs w:val="22"/>
         </w:rPr>
-        <w:pict w14:anchorId="643A9ABB">
+        <w:pict w14:anchorId="5C35C56C">
           <v:rect id="_x0000_i1037" style="width:0;height:1.5pt" o:hralign="center" o:hrstd="t" o:hr="t" fillcolor="#a0a0a0" stroked="f"/>
         </w:pict>
       </w:r>
@@ -3956,7 +3956,7 @@
           <w:szCs w:val="22"/>
         </w:rPr>
         <w:drawing>
-          <wp:inline distT="0" distB="0" distL="0" distR="0" wp14:anchorId="374EEC4C" wp14:editId="69CBFCD1">
+          <wp:inline distT="0" distB="0" distL="0" distR="0" wp14:anchorId="15E3AC49" wp14:editId="5A551D26">
             <wp:extent cx="10344682" cy="6496384"/>
             <wp:effectExtent l="0" t="0" r="0" b="0"/>
             <wp:docPr id="14" name="Picture 14"/>
@@ -4050,7 +4050,7 @@
           <w:sz w:val="22"/>
           <w:szCs w:val="22"/>
         </w:rPr>
-        <w:pict w14:anchorId="51AEDCA1">
+        <w:pict w14:anchorId="0E4C103A">
           <v:rect id="_x0000_i1039" style="width:0;height:1.5pt" o:hralign="center" o:hrstd="t" o:hr="t" fillcolor="#a0a0a0" stroked="f"/>
         </w:pict>
       </w:r>
@@ -4221,7 +4221,7 @@
           <w:sz w:val="22"/>
           <w:szCs w:val="22"/>
         </w:rPr>
-        <w:pict w14:anchorId="3C52EC3F">
+        <w:pict w14:anchorId="1717373F">
           <v:rect id="_x0000_i1040" style="width:0;height:1.5pt" o:hralign="center" o:hrstd="t" o:hr="t" fillcolor="#a0a0a0" stroked="f"/>
         </w:pict>
       </w:r>
@@ -4425,7 +4425,7 @@
           <w:sz w:val="22"/>
           <w:szCs w:val="22"/>
         </w:rPr>
-        <w:pict w14:anchorId="543E0BF8">
+        <w:pict w14:anchorId="70AF2BDF">
           <v:rect id="_x0000_i1041" style="width:0;height:1.5pt" o:hralign="center" o:hrstd="t" o:hr="t" fillcolor="#a0a0a0" stroked="f"/>
         </w:pict>
       </w:r>
@@ -4505,8 +4505,18 @@
           <w:rFonts w:ascii="Calibri" w:hAnsi="Calibri" w:cs="Calibri"/>
           <w:color w:val="212121"/>
         </w:rPr>
-        <w:t>The code is maintainable, the architecture is extensible, and the foundation is solid. We're excited to keep building on it.</w:t>
-      </w:r>
+        <w:t xml:space="preserve">The code is maintainable, the architecture is extensible, and the foundation is solid. We're excited to keep building on it. The full source code is open source and available on GitHub — contributions and forks are welcome: </w:t>
+      </w:r>
+      <w:hyperlink r:id="rId14" w:history="1">
+        <w:r>
+          <w:rPr>
+            <w:rStyle w:val="Hyperlink"/>
+            <w:rFonts w:ascii="Calibri" w:hAnsi="Calibri" w:cs="Calibri"/>
+            <w:color w:val="1A56DB"/>
+          </w:rPr>
+          <w:t>github.com/rkneela0912/IT-Asset-Request-Portal</w:t>
+        </w:r>
+      </w:hyperlink>
     </w:p>
     <w:p>
       <w:pPr>
@@ -4525,14 +4535,14 @@
           <w:sz w:val="22"/>
           <w:szCs w:val="22"/>
         </w:rPr>
-        <w:pict w14:anchorId="6B5E1630">
+        <w:pict w14:anchorId="0B330EDD">
           <v:rect id="_x0000_i1042" style="width:0;height:1.5pt" o:hralign="center" o:hrstd="t" o:hr="t" fillcolor="#a0a0a0" stroked="f"/>
         </w:pict>
       </w:r>
     </w:p>
     <w:p>
       <w:pPr>
-        <w:divId w:val="2020694617"/>
+        <w:divId w:val="420687017"/>
         <w:rPr>
           <w:rFonts w:ascii="Calibri" w:eastAsia="Times New Roman" w:hAnsi="Calibri" w:cs="Calibri"/>
           <w:color w:val="4B5563"/>
@@ -4628,6 +4638,64 @@
         </w:rPr>
         <w:t>.</w:t>
       </w:r>
+      <w:r>
+        <w:rPr>
+          <w:rFonts w:ascii="Calibri" w:eastAsia="Times New Roman" w:hAnsi="Calibri" w:cs="Calibri"/>
+          <w:color w:val="4B5563"/>
+          <w:sz w:val="20"/>
+          <w:szCs w:val="20"/>
+        </w:rPr>
+        <w:t xml:space="preserve"> </w:t>
+      </w:r>
+      <w:r>
+        <w:rPr>
+          <w:rFonts w:ascii="Calibri" w:eastAsia="Times New Roman" w:hAnsi="Calibri" w:cs="Calibri"/>
+          <w:color w:val="4B5563"/>
+          <w:sz w:val="20"/>
+          <w:szCs w:val="20"/>
+        </w:rPr>
+        <w:br/>
+      </w:r>
+      <w:r>
+        <w:rPr>
+          <w:rFonts w:ascii="Calibri" w:eastAsia="Times New Roman" w:hAnsi="Calibri" w:cs="Calibri"/>
+          <w:color w:val="4B5563"/>
+          <w:sz w:val="20"/>
+          <w:szCs w:val="20"/>
+        </w:rPr>
+        <w:br/>
+      </w:r>
+      <w:r>
+        <w:rPr>
+          <w:rStyle w:val="Strong"/>
+          <w:rFonts w:ascii="Calibri" w:eastAsia="Times New Roman" w:hAnsi="Calibri" w:cs="Calibri"/>
+          <w:color w:val="4B5563"/>
+          <w:sz w:val="20"/>
+          <w:szCs w:val="20"/>
+        </w:rPr>
+        <w:t>Source code:</w:t>
+      </w:r>
+      <w:r>
+        <w:rPr>
+          <w:rFonts w:ascii="Calibri" w:eastAsia="Times New Roman" w:hAnsi="Calibri" w:cs="Calibri"/>
+          <w:color w:val="4B5563"/>
+          <w:sz w:val="20"/>
+          <w:szCs w:val="20"/>
+        </w:rPr>
+        <w:t xml:space="preserve"> </w:t>
+      </w:r>
+      <w:hyperlink r:id="rId15" w:history="1">
+        <w:r>
+          <w:rPr>
+            <w:rStyle w:val="Hyperlink"/>
+            <w:rFonts w:ascii="Calibri" w:eastAsia="Times New Roman" w:hAnsi="Calibri" w:cs="Calibri"/>
+            <w:color w:val="1A56DB"/>
+            <w:sz w:val="20"/>
+            <w:szCs w:val="20"/>
+          </w:rPr>
+          <w:t>github.com/rkneela0912/IT-Asset-Request-Portal</w:t>
+        </w:r>
+      </w:hyperlink>
       <w:r>
         <w:rPr>
           <w:rFonts w:ascii="Calibri" w:eastAsia="Times New Roman" w:hAnsi="Calibri" w:cs="Calibri"/>
@@ -4651,9 +4719,122 @@
 <file path=word/numbering.xml><?xml version="1.0" encoding="utf-8"?>
 <w:numbering xmlns:wpc="http://schemas.microsoft.com/office/word/2010/wordprocessingCanvas" xmlns:cx="http://schemas.microsoft.com/office/drawing/2014/chartex" xmlns:cx1="http://schemas.microsoft.com/office/drawing/2015/9/8/chartex" xmlns:cx2="http://schemas.microsoft.com/office/drawing/2015/10/21/chartex" xmlns:cx3="http://schemas.microsoft.com/office/drawing/2016/5/9/chartex" xmlns:cx4="http://schemas.microsoft.com/office/drawing/2016/5/10/chartex" xmlns:cx5="http://schemas.microsoft.com/office/drawing/2016/5/11/chartex" xmlns:cx6="http://schemas.microsoft.com/office/drawing/2016/5/12/chartex" xmlns:cx7="http://schemas.microsoft.com/office/drawing/2016/5/13/chartex" xmlns:cx8="http://schemas.microsoft.com/office/drawing/2016/5/14/chartex" xmlns:mc="http://schemas.openxmlformats.org/markup-compatibility/2006" xmlns:aink="http://schemas.microsoft.com/office/drawing/2016/ink" xmlns:am3d="http://schemas.microsoft.com/office/drawing/2017/model3d" xmlns:o="urn:schemas-microsoft-com:office:office" xmlns:oel="http://schemas.microsoft.com/office/2019/extlst" xmlns:r="http://schemas.openxmlformats.org/officeDocument/2006/relationships" xmlns:m="http://schemas.openxmlformats.org/officeDocument/2006/math" xmlns:v="urn:schemas-microsoft-com:vml" xmlns:wp14="http://schemas.microsoft.com/office/word/2010/wordprocessingDrawing" xmlns:wp="http://schemas.openxmlformats.org/drawingml/2006/wordprocessingDrawing" xmlns:w10="urn:schemas-microsoft-com:office:word" xmlns:w="http://schemas.openxmlformats.org/wordprocessingml/2006/main" xmlns:w14="http://schemas.microsoft.com/office/word/2010/wordml" xmlns:w15="http://schemas.microsoft.com/office/word/2012/wordml" xmlns:w16cex="http://schemas.microsoft.com/office/word/2018/wordml/cex" xmlns:w16cid="http://schemas.microsoft.com/office/word/2016/wordml/cid" xmlns:w16="http://schemas.microsoft.com/office/word/2018/wordml" xmlns:w16du="http://schemas.microsoft.com/office/word/2023/wordml/word16du" xmlns:w16sdtdh="http://schemas.microsoft.com/office/word/2020/wordml/sdtdatahash" xmlns:w16sdtfl="http://schemas.microsoft.com/office/word/2024/wordml/sdtformatlock" xmlns:w16se="http://schemas.microsoft.com/office/word/2015/wordml/symex" xmlns:wpg="http://schemas.microsoft.com/office/word/2010/wordprocessingGroup" xmlns:wpi="http://schemas.microsoft.com/office/word/2010/wordprocessingInk" xmlns:wne="http://schemas.microsoft.com/office/word/2006/wordml" xmlns:wps="http://schemas.microsoft.com/office/word/2010/wordprocessingShape" mc:Ignorable="w14 w15 w16se w16cid w16 w16cex w16sdtdh w16sdtfl w16du wp14">
   <w:abstractNum w:abstractNumId="0" w15:restartNumberingAfterBreak="0">
-    <w:nsid w:val="0B672497"/>
+    <w:nsid w:val="0C874AB7"/>
     <w:multiLevelType w:val="multilevel"/>
-    <w:tmpl w:val="D2B4BD30"/>
+    <w:tmpl w:val="D8EA2A48"/>
+    <w:lvl w:ilvl="0">
+      <w:start w:val="1"/>
+      <w:numFmt w:val="decimal"/>
+      <w:lvlText w:val="%1."/>
+      <w:lvlJc w:val="left"/>
+      <w:pPr>
+        <w:tabs>
+          <w:tab w:val="num" w:pos="720"/>
+        </w:tabs>
+        <w:ind w:left="720" w:hanging="360"/>
+      </w:pPr>
+    </w:lvl>
+    <w:lvl w:ilvl="1" w:tentative="1">
+      <w:start w:val="1"/>
+      <w:numFmt w:val="decimal"/>
+      <w:lvlText w:val="%2."/>
+      <w:lvlJc w:val="left"/>
+      <w:pPr>
+        <w:tabs>
+          <w:tab w:val="num" w:pos="1440"/>
+        </w:tabs>
+        <w:ind w:left="1440" w:hanging="360"/>
+      </w:pPr>
+    </w:lvl>
+    <w:lvl w:ilvl="2" w:tentative="1">
+      <w:start w:val="1"/>
+      <w:numFmt w:val="decimal"/>
+      <w:lvlText w:val="%3."/>
+      <w:lvlJc w:val="left"/>
+      <w:pPr>
+        <w:tabs>
+          <w:tab w:val="num" w:pos="2160"/>
+        </w:tabs>
+        <w:ind w:left="2160" w:hanging="360"/>
+      </w:pPr>
+    </w:lvl>
+    <w:lvl w:ilvl="3" w:tentative="1">
+      <w:start w:val="1"/>
+      <w:numFmt w:val="decimal"/>
+      <w:lvlText w:val="%4."/>
+      <w:lvlJc w:val="left"/>
+      <w:pPr>
+        <w:tabs>
+          <w:tab w:val="num" w:pos="2880"/>
+        </w:tabs>
+        <w:ind w:left="2880" w:hanging="360"/>
+      </w:pPr>
+    </w:lvl>
+    <w:lvl w:ilvl="4" w:tentative="1">
+      <w:start w:val="1"/>
+      <w:numFmt w:val="decimal"/>
+      <w:lvlText w:val="%5."/>
+      <w:lvlJc w:val="left"/>
+      <w:pPr>
+        <w:tabs>
+          <w:tab w:val="num" w:pos="3600"/>
+        </w:tabs>
+        <w:ind w:left="3600" w:hanging="360"/>
+      </w:pPr>
+    </w:lvl>
+    <w:lvl w:ilvl="5" w:tentative="1">
+      <w:start w:val="1"/>
+      <w:numFmt w:val="decimal"/>
+      <w:lvlText w:val="%6."/>
+      <w:lvlJc w:val="left"/>
+      <w:pPr>
+        <w:tabs>
+          <w:tab w:val="num" w:pos="4320"/>
+        </w:tabs>
+        <w:ind w:left="4320" w:hanging="360"/>
+      </w:pPr>
+    </w:lvl>
+    <w:lvl w:ilvl="6" w:tentative="1">
+      <w:start w:val="1"/>
+      <w:numFmt w:val="decimal"/>
+      <w:lvlText w:val="%7."/>
+      <w:lvlJc w:val="left"/>
+      <w:pPr>
+        <w:tabs>
+          <w:tab w:val="num" w:pos="5040"/>
+        </w:tabs>
+        <w:ind w:left="5040" w:hanging="360"/>
+      </w:pPr>
+    </w:lvl>
+    <w:lvl w:ilvl="7" w:tentative="1">
+      <w:start w:val="1"/>
+      <w:numFmt w:val="decimal"/>
+      <w:lvlText w:val="%8."/>
+      <w:lvlJc w:val="left"/>
+      <w:pPr>
+        <w:tabs>
+          <w:tab w:val="num" w:pos="5760"/>
+        </w:tabs>
+        <w:ind w:left="5760" w:hanging="360"/>
+      </w:pPr>
+    </w:lvl>
+    <w:lvl w:ilvl="8" w:tentative="1">
+      <w:start w:val="1"/>
+      <w:numFmt w:val="decimal"/>
+      <w:lvlText w:val="%9."/>
+      <w:lvlJc w:val="left"/>
+      <w:pPr>
+        <w:tabs>
+          <w:tab w:val="num" w:pos="6480"/>
+        </w:tabs>
+        <w:ind w:left="6480" w:hanging="360"/>
+      </w:pPr>
+    </w:lvl>
+  </w:abstractNum>
+  <w:abstractNum w:abstractNumId="1" w15:restartNumberingAfterBreak="0">
+    <w:nsid w:val="1B3616D6"/>
+    <w:multiLevelType w:val="multilevel"/>
+    <w:tmpl w:val="A5F06BE6"/>
     <w:lvl w:ilvl="0">
       <w:start w:val="1"/>
       <w:numFmt w:val="bullet"/>
@@ -4799,10 +4980,10 @@
       </w:rPr>
     </w:lvl>
   </w:abstractNum>
-  <w:abstractNum w:abstractNumId="1" w15:restartNumberingAfterBreak="0">
-    <w:nsid w:val="346A0563"/>
+  <w:abstractNum w:abstractNumId="2" w15:restartNumberingAfterBreak="0">
+    <w:nsid w:val="242568D4"/>
     <w:multiLevelType w:val="multilevel"/>
-    <w:tmpl w:val="9E7C7928"/>
+    <w:tmpl w:val="978C4F14"/>
     <w:lvl w:ilvl="0">
       <w:start w:val="1"/>
       <w:numFmt w:val="decimal"/>
@@ -4912,123 +5093,10 @@
       </w:pPr>
     </w:lvl>
   </w:abstractNum>
-  <w:abstractNum w:abstractNumId="2" w15:restartNumberingAfterBreak="0">
-    <w:nsid w:val="4ACC3320"/>
+  <w:abstractNum w:abstractNumId="3" w15:restartNumberingAfterBreak="0">
+    <w:nsid w:val="40D31889"/>
     <w:multiLevelType w:val="multilevel"/>
-    <w:tmpl w:val="5AFCF6A4"/>
-    <w:lvl w:ilvl="0">
-      <w:start w:val="1"/>
-      <w:numFmt w:val="decimal"/>
-      <w:lvlText w:val="%1."/>
-      <w:lvlJc w:val="left"/>
-      <w:pPr>
-        <w:tabs>
-          <w:tab w:val="num" w:pos="720"/>
-        </w:tabs>
-        <w:ind w:left="720" w:hanging="360"/>
-      </w:pPr>
-    </w:lvl>
-    <w:lvl w:ilvl="1" w:tentative="1">
-      <w:start w:val="1"/>
-      <w:numFmt w:val="decimal"/>
-      <w:lvlText w:val="%2."/>
-      <w:lvlJc w:val="left"/>
-      <w:pPr>
-        <w:tabs>
-          <w:tab w:val="num" w:pos="1440"/>
-        </w:tabs>
-        <w:ind w:left="1440" w:hanging="360"/>
-      </w:pPr>
-    </w:lvl>
-    <w:lvl w:ilvl="2" w:tentative="1">
-      <w:start w:val="1"/>
-      <w:numFmt w:val="decimal"/>
-      <w:lvlText w:val="%3."/>
-      <w:lvlJc w:val="left"/>
-      <w:pPr>
-        <w:tabs>
-          <w:tab w:val="num" w:pos="2160"/>
-        </w:tabs>
-        <w:ind w:left="2160" w:hanging="360"/>
-      </w:pPr>
-    </w:lvl>
-    <w:lvl w:ilvl="3" w:tentative="1">
-      <w:start w:val="1"/>
-      <w:numFmt w:val="decimal"/>
-      <w:lvlText w:val="%4."/>
-      <w:lvlJc w:val="left"/>
-      <w:pPr>
-        <w:tabs>
-          <w:tab w:val="num" w:pos="2880"/>
-        </w:tabs>
-        <w:ind w:left="2880" w:hanging="360"/>
-      </w:pPr>
-    </w:lvl>
-    <w:lvl w:ilvl="4" w:tentative="1">
-      <w:start w:val="1"/>
-      <w:numFmt w:val="decimal"/>
-      <w:lvlText w:val="%5."/>
-      <w:lvlJc w:val="left"/>
-      <w:pPr>
-        <w:tabs>
-          <w:tab w:val="num" w:pos="3600"/>
-        </w:tabs>
-        <w:ind w:left="3600" w:hanging="360"/>
-      </w:pPr>
-    </w:lvl>
-    <w:lvl w:ilvl="5" w:tentative="1">
-      <w:start w:val="1"/>
-      <w:numFmt w:val="decimal"/>
-      <w:lvlText w:val="%6."/>
-      <w:lvlJc w:val="left"/>
-      <w:pPr>
-        <w:tabs>
-          <w:tab w:val="num" w:pos="4320"/>
-        </w:tabs>
-        <w:ind w:left="4320" w:hanging="360"/>
-      </w:pPr>
-    </w:lvl>
-    <w:lvl w:ilvl="6" w:tentative="1">
-      <w:start w:val="1"/>
-      <w:numFmt w:val="decimal"/>
-      <w:lvlText w:val="%7."/>
-      <w:lvlJc w:val="left"/>
-      <w:pPr>
-        <w:tabs>
-          <w:tab w:val="num" w:pos="5040"/>
-        </w:tabs>
-        <w:ind w:left="5040" w:hanging="360"/>
-      </w:pPr>
-    </w:lvl>
-    <w:lvl w:ilvl="7" w:tentative="1">
-      <w:start w:val="1"/>
-      <w:numFmt w:val="decimal"/>
-      <w:lvlText w:val="%8."/>
-      <w:lvlJc w:val="left"/>
-      <w:pPr>
-        <w:tabs>
-          <w:tab w:val="num" w:pos="5760"/>
-        </w:tabs>
-        <w:ind w:left="5760" w:hanging="360"/>
-      </w:pPr>
-    </w:lvl>
-    <w:lvl w:ilvl="8" w:tentative="1">
-      <w:start w:val="1"/>
-      <w:numFmt w:val="decimal"/>
-      <w:lvlText w:val="%9."/>
-      <w:lvlJc w:val="left"/>
-      <w:pPr>
-        <w:tabs>
-          <w:tab w:val="num" w:pos="6480"/>
-        </w:tabs>
-        <w:ind w:left="6480" w:hanging="360"/>
-      </w:pPr>
-    </w:lvl>
-  </w:abstractNum>
-  <w:abstractNum w:abstractNumId="3" w15:restartNumberingAfterBreak="0">
-    <w:nsid w:val="6ECA11B0"/>
-    <w:multiLevelType w:val="multilevel"/>
-    <w:tmpl w:val="723E0EA2"/>
+    <w:tmpl w:val="F1D66748"/>
     <w:lvl w:ilvl="0">
       <w:start w:val="1"/>
       <w:numFmt w:val="bullet"/>
@@ -5174,17 +5242,17 @@
       </w:rPr>
     </w:lvl>
   </w:abstractNum>
-  <w:num w:numId="1" w16cid:durableId="1361005338">
+  <w:num w:numId="1" w16cid:durableId="924999690">
+    <w:abstractNumId w:val="0"/>
+  </w:num>
+  <w:num w:numId="2" w16cid:durableId="1504971066">
+    <w:abstractNumId w:val="1"/>
+  </w:num>
+  <w:num w:numId="3" w16cid:durableId="142671899">
     <w:abstractNumId w:val="2"/>
   </w:num>
-  <w:num w:numId="2" w16cid:durableId="1449815338">
+  <w:num w:numId="4" w16cid:durableId="1237400867">
     <w:abstractNumId w:val="3"/>
-  </w:num>
-  <w:num w:numId="3" w16cid:durableId="1087918542">
-    <w:abstractNumId w:val="1"/>
-  </w:num>
-  <w:num w:numId="4" w16cid:durableId="1156455278">
-    <w:abstractNumId w:val="0"/>
   </w:num>
 </w:numbering>
 </file>
@@ -5939,6 +6007,28 @@
       <w:iCs/>
     </w:rPr>
   </w:style>
+  <w:style w:type="character" w:styleId="Hyperlink">
+    <w:name w:val="Hyperlink"/>
+    <w:basedOn w:val="DefaultParagraphFont"/>
+    <w:uiPriority w:val="99"/>
+    <w:semiHidden/>
+    <w:unhideWhenUsed/>
+    <w:rPr>
+      <w:color w:val="0000FF"/>
+      <w:u w:val="single"/>
+    </w:rPr>
+  </w:style>
+  <w:style w:type="character" w:styleId="FollowedHyperlink">
+    <w:name w:val="FollowedHyperlink"/>
+    <w:basedOn w:val="DefaultParagraphFont"/>
+    <w:uiPriority w:val="99"/>
+    <w:semiHidden/>
+    <w:unhideWhenUsed/>
+    <w:rPr>
+      <w:color w:val="800080"/>
+      <w:u w:val="single"/>
+    </w:rPr>
+  </w:style>
 </w:styles>
 </file>
 

</xml_diff>